<commit_message>
docs: Updating DisplayHelp section; regenerated guides
</commit_message>
<xml_diff>
--- a/DisplayHelp-0.6.12-User-Guide.docx
+++ b/DisplayHelp-0.6.12-User-Guide.docx
@@ -2,7 +2,7 @@
 <file path=word/document.xml><?xml version="1.0" encoding="utf-8"?>
 <w:document xmlns:w="http://schemas.openxmlformats.org/wordprocessingml/2006/main" xmlns:m="http://schemas.openxmlformats.org/officeDocument/2006/math" xmlns:r="http://schemas.openxmlformats.org/officeDocument/2006/relationships" xmlns:o="urn:schemas-microsoft-com:office:office" xmlns:v="urn:schemas-microsoft-com:vml" xmlns:w10="urn:schemas-microsoft-com:office:word" xmlns:a="http://schemas.openxmlformats.org/drawingml/2006/main" xmlns:pic="http://schemas.openxmlformats.org/drawingml/2006/picture" xmlns:wp="http://schemas.openxmlformats.org/drawingml/2006/wordprocessingDrawing">
   <w:body>
-    <w:bookmarkStart w:id="138" w:name="displayhelp-0.6.12-user-guide"/>
+    <w:bookmarkStart w:id="144" w:name="displayhelp-0.6.12-user-guide"/>
     <w:p>
       <w:pPr>
         <w:pStyle w:val="Heading1"/>
@@ -266,6 +266,23 @@
             <w:rStyle w:val="Hyperlink"/>
           </w:rPr>
           <w:t xml:space="preserve">Start at login, Quit, About</w:t>
+        </w:r>
+      </w:hyperlink>
+    </w:p>
+    <w:p>
+      <w:pPr>
+        <w:pStyle w:val="Compact"/>
+        <w:numPr>
+          <w:ilvl w:val="0"/>
+          <w:numId w:val="1001"/>
+        </w:numPr>
+      </w:pPr>
+      <w:hyperlink w:anchor="updating-displayhelp">
+        <w:r>
+          <w:rPr>
+            <w:rStyle w:val="Hyperlink"/>
+          </w:rPr>
+          <w:t xml:space="preserve">Updating DisplayHelp</w:t>
         </w:r>
       </w:hyperlink>
     </w:p>
@@ -7643,7 +7660,668 @@
     </w:p>
     <w:bookmarkEnd w:id="120"/>
     <w:bookmarkEnd w:id="121"/>
-    <w:bookmarkStart w:id="125" w:name="the-connect-dialog"/>
+    <w:bookmarkStart w:id="127" w:name="updating-displayhelp"/>
+    <w:p>
+      <w:pPr>
+        <w:pStyle w:val="Heading2"/>
+      </w:pPr>
+      <w:r>
+        <w:t xml:space="preserve">Updating DisplayHelp</w:t>
+      </w:r>
+    </w:p>
+    <w:p>
+      <w:pPr>
+        <w:pStyle w:val="FirstParagraph"/>
+      </w:pPr>
+      <w:r>
+        <w:t xml:space="preserve">There are four ways to get a new version. They all install the same signed package and keep your profiles, history and settings.</w:t>
+      </w:r>
+    </w:p>
+    <w:tbl>
+      <w:tblPr>
+        <w:tblStyle w:val="Table"/>
+        <w:tblW w:type="pct" w:w="5000"/>
+        <w:tblLayout w:type="fixed"/>
+        <w:tblLook w:firstRow="1" w:lastRow="0" w:firstColumn="0" w:lastColumn="0" w:noHBand="0" w:noVBand="0" w:val="0020"/>
+      </w:tblPr>
+      <w:tblGrid>
+        <w:gridCol w:w="1980"/>
+        <w:gridCol w:w="1980"/>
+        <w:gridCol w:w="1980"/>
+        <w:gridCol w:w="1980"/>
+      </w:tblGrid>
+      <w:tr>
+        <w:trPr>
+          <w:tblHeader w:val="on"/>
+        </w:trPr>
+        <w:tc>
+          <w:tcPr/>
+          <w:p>
+            <w:pPr>
+              <w:pStyle w:val="Compact"/>
+            </w:pPr>
+            <w:r>
+              <w:t xml:space="preserve">Way</w:t>
+            </w:r>
+          </w:p>
+        </w:tc>
+        <w:tc>
+          <w:tcPr/>
+          <w:p>
+            <w:pPr>
+              <w:pStyle w:val="Compact"/>
+            </w:pPr>
+            <w:r>
+              <w:t xml:space="preserve">Who clicks</w:t>
+            </w:r>
+          </w:p>
+        </w:tc>
+        <w:tc>
+          <w:tcPr/>
+          <w:p>
+            <w:pPr>
+              <w:pStyle w:val="Compact"/>
+            </w:pPr>
+            <w:r>
+              <w:t xml:space="preserve">Needs an administrator?</w:t>
+            </w:r>
+          </w:p>
+        </w:tc>
+        <w:tc>
+          <w:tcPr/>
+          <w:p>
+            <w:pPr>
+              <w:pStyle w:val="Compact"/>
+            </w:pPr>
+            <w:r>
+              <w:t xml:space="preserve">Best for</w:t>
+            </w:r>
+          </w:p>
+        </w:tc>
+      </w:tr>
+      <w:tr>
+        <w:tc>
+          <w:tcPr/>
+          <w:p>
+            <w:pPr>
+              <w:pStyle w:val="Compact"/>
+            </w:pPr>
+            <w:r>
+              <w:rPr>
+                <w:b/>
+                <w:bCs/>
+              </w:rPr>
+              <w:t xml:space="preserve">In-app, Install</w:t>
+            </w:r>
+          </w:p>
+        </w:tc>
+        <w:tc>
+          <w:tcPr/>
+          <w:p>
+            <w:pPr>
+              <w:pStyle w:val="Compact"/>
+            </w:pPr>
+            <w:r>
+              <w:t xml:space="preserve">Any user, from Check for Update…</w:t>
+            </w:r>
+          </w:p>
+        </w:tc>
+        <w:tc>
+          <w:tcPr/>
+          <w:p>
+            <w:pPr>
+              <w:pStyle w:val="Compact"/>
+            </w:pPr>
+            <w:r>
+              <w:t xml:space="preserve">Once per Mac to approve the helper, or never with the MDM profile</w:t>
+            </w:r>
+          </w:p>
+        </w:tc>
+        <w:tc>
+          <w:tcPr/>
+          <w:p>
+            <w:pPr>
+              <w:pStyle w:val="Compact"/>
+            </w:pPr>
+            <w:r>
+              <w:t xml:space="preserve">Most Macs</w:t>
+            </w:r>
+          </w:p>
+        </w:tc>
+      </w:tr>
+      <w:tr>
+        <w:tc>
+          <w:tcPr/>
+          <w:p>
+            <w:pPr>
+              <w:pStyle w:val="Compact"/>
+            </w:pPr>
+            <w:r>
+              <w:rPr>
+                <w:b/>
+                <w:bCs/>
+              </w:rPr>
+              <w:t xml:space="preserve">In-app, Download</w:t>
+            </w:r>
+          </w:p>
+        </w:tc>
+        <w:tc>
+          <w:tcPr/>
+          <w:p>
+            <w:pPr>
+              <w:pStyle w:val="Compact"/>
+            </w:pPr>
+            <w:r>
+              <w:t xml:space="preserve">Any user, from Check for Update…</w:t>
+            </w:r>
+          </w:p>
+        </w:tc>
+        <w:tc>
+          <w:tcPr/>
+          <w:p>
+            <w:pPr>
+              <w:pStyle w:val="Compact"/>
+            </w:pPr>
+            <w:r>
+              <w:t xml:space="preserve">Yes, when the downloaded package opens</w:t>
+            </w:r>
+          </w:p>
+        </w:tc>
+        <w:tc>
+          <w:tcPr/>
+          <w:p>
+            <w:pPr>
+              <w:pStyle w:val="Compact"/>
+            </w:pPr>
+            <w:r>
+              <w:t xml:space="preserve">A Mac where the helper is not approved</w:t>
+            </w:r>
+          </w:p>
+        </w:tc>
+      </w:tr>
+      <w:tr>
+        <w:tc>
+          <w:tcPr/>
+          <w:p>
+            <w:pPr>
+              <w:pStyle w:val="Compact"/>
+            </w:pPr>
+            <w:r>
+              <w:rPr>
+                <w:b/>
+                <w:bCs/>
+              </w:rPr>
+              <w:t xml:space="preserve">Homebrew</w:t>
+            </w:r>
+          </w:p>
+        </w:tc>
+        <w:tc>
+          <w:tcPr/>
+          <w:p>
+            <w:pPr>
+              <w:pStyle w:val="Compact"/>
+            </w:pPr>
+            <w:r>
+              <w:t xml:space="preserve">Someone with a terminal</w:t>
+            </w:r>
+          </w:p>
+        </w:tc>
+        <w:tc>
+          <w:tcPr/>
+          <w:p>
+            <w:pPr>
+              <w:pStyle w:val="Compact"/>
+            </w:pPr>
+            <w:r>
+              <w:t xml:space="preserve">Yes, Homebrew asks for sudo</w:t>
+            </w:r>
+          </w:p>
+        </w:tc>
+        <w:tc>
+          <w:tcPr/>
+          <w:p>
+            <w:pPr>
+              <w:pStyle w:val="Compact"/>
+            </w:pPr>
+            <w:r>
+              <w:t xml:space="preserve">Developers and power users</w:t>
+            </w:r>
+          </w:p>
+        </w:tc>
+      </w:tr>
+      <w:tr>
+        <w:tc>
+          <w:tcPr/>
+          <w:p>
+            <w:pPr>
+              <w:pStyle w:val="Compact"/>
+            </w:pPr>
+            <w:r>
+              <w:rPr>
+                <w:b/>
+                <w:bCs/>
+              </w:rPr>
+              <w:t xml:space="preserve">MDM push</w:t>
+            </w:r>
+          </w:p>
+        </w:tc>
+        <w:tc>
+          <w:tcPr/>
+          <w:p>
+            <w:pPr>
+              <w:pStyle w:val="Compact"/>
+            </w:pPr>
+            <w:r>
+              <w:t xml:space="preserve">Nobody; IT pushes the package</w:t>
+            </w:r>
+          </w:p>
+        </w:tc>
+        <w:tc>
+          <w:tcPr/>
+          <w:p>
+            <w:pPr>
+              <w:pStyle w:val="Compact"/>
+            </w:pPr>
+            <w:r>
+              <w:t xml:space="preserve">No</w:t>
+            </w:r>
+          </w:p>
+        </w:tc>
+        <w:tc>
+          <w:tcPr/>
+          <w:p>
+            <w:pPr>
+              <w:pStyle w:val="Compact"/>
+            </w:pPr>
+            <w:r>
+              <w:t xml:space="preserve">Managed fleets</w:t>
+            </w:r>
+          </w:p>
+        </w:tc>
+      </w:tr>
+    </w:tbl>
+    <w:bookmarkStart w:id="122" w:name="in-app-check-for-update"/>
+    <w:p>
+      <w:pPr>
+        <w:pStyle w:val="Heading3"/>
+      </w:pPr>
+      <w:r>
+        <w:t xml:space="preserve">In-app: Check for Update…</w:t>
+      </w:r>
+    </w:p>
+    <w:p>
+      <w:pPr>
+        <w:pStyle w:val="FirstParagraph"/>
+      </w:pPr>
+      <w:r>
+        <w:t xml:space="preserve">Click</w:t>
+      </w:r>
+      <w:r>
+        <w:t xml:space="preserve"> </w:t>
+      </w:r>
+      <w:r>
+        <w:rPr>
+          <w:b/>
+          <w:bCs/>
+        </w:rPr>
+        <w:t xml:space="preserve">Check for Update…</w:t>
+      </w:r>
+      <w:r>
+        <w:t xml:space="preserve"> </w:t>
+      </w:r>
+      <w:r>
+        <w:t xml:space="preserve">beside Quit. DisplayHelp asks GitHub for the newest release and compares it with the version you are running. If you are current it says so. If a newer version exists the dialog names both versions and offers:</w:t>
+      </w:r>
+    </w:p>
+    <w:p>
+      <w:pPr>
+        <w:pStyle w:val="Compact"/>
+        <w:numPr>
+          <w:ilvl w:val="0"/>
+          <w:numId w:val="1009"/>
+        </w:numPr>
+      </w:pPr>
+      <w:r>
+        <w:rPr>
+          <w:b/>
+          <w:bCs/>
+        </w:rPr>
+        <w:t xml:space="preserve">Install</w:t>
+      </w:r>
+      <w:r>
+        <w:t xml:space="preserve">, when the DisplayHelp Updater helper is approved on this Mac. DisplayHelp downloads the release package, verifies that Apple and DisplayHelp’s Developer ID signed it, runs the macOS installer, quits and reopens on the new version. No password, no further clicks, and it works from a standard account.</w:t>
+      </w:r>
+    </w:p>
+    <w:p>
+      <w:pPr>
+        <w:pStyle w:val="Compact"/>
+        <w:numPr>
+          <w:ilvl w:val="0"/>
+          <w:numId w:val="1009"/>
+        </w:numPr>
+      </w:pPr>
+      <w:r>
+        <w:rPr>
+          <w:b/>
+          <w:bCs/>
+        </w:rPr>
+        <w:t xml:space="preserve">Set Up Self-Service Updates…</w:t>
+      </w:r>
+      <w:r>
+        <w:t xml:space="preserve">, when the helper is not yet approved. See the next section.</w:t>
+      </w:r>
+    </w:p>
+    <w:p>
+      <w:pPr>
+        <w:pStyle w:val="Compact"/>
+        <w:numPr>
+          <w:ilvl w:val="0"/>
+          <w:numId w:val="1009"/>
+        </w:numPr>
+      </w:pPr>
+      <w:r>
+        <w:rPr>
+          <w:b/>
+          <w:bCs/>
+        </w:rPr>
+        <w:t xml:space="preserve">Download</w:t>
+      </w:r>
+      <w:r>
+        <w:t xml:space="preserve">, always. It opens the release package in your browser; open the package and macOS asks for an administrator password as for any installer.</w:t>
+      </w:r>
+    </w:p>
+    <w:p>
+      <w:pPr>
+        <w:pStyle w:val="Compact"/>
+        <w:numPr>
+          <w:ilvl w:val="0"/>
+          <w:numId w:val="1009"/>
+        </w:numPr>
+      </w:pPr>
+      <w:r>
+        <w:rPr>
+          <w:b/>
+          <w:bCs/>
+        </w:rPr>
+        <w:t xml:space="preserve">Later</w:t>
+      </w:r>
+      <w:r>
+        <w:t xml:space="preserve">, which closes the dialog.</w:t>
+      </w:r>
+    </w:p>
+    <w:bookmarkEnd w:id="122"/>
+    <w:bookmarkStart w:id="123" w:name="one-time-approval-no-mdm-needed"/>
+    <w:p>
+      <w:pPr>
+        <w:pStyle w:val="Heading3"/>
+      </w:pPr>
+      <w:r>
+        <w:t xml:space="preserve">One-time approval, no MDM needed</w:t>
+      </w:r>
+    </w:p>
+    <w:p>
+      <w:pPr>
+        <w:pStyle w:val="FirstParagraph"/>
+      </w:pPr>
+      <w:r>
+        <w:t xml:space="preserve">The helper that installs updates runs with system privileges, so macOS asks an administrator to allow it once per Mac:</w:t>
+      </w:r>
+    </w:p>
+    <w:p>
+      <w:pPr>
+        <w:pStyle w:val="Compact"/>
+        <w:numPr>
+          <w:ilvl w:val="0"/>
+          <w:numId w:val="1010"/>
+        </w:numPr>
+      </w:pPr>
+      <w:r>
+        <w:t xml:space="preserve">Click</w:t>
+      </w:r>
+      <w:r>
+        <w:t xml:space="preserve"> </w:t>
+      </w:r>
+      <w:r>
+        <w:rPr>
+          <w:b/>
+          <w:bCs/>
+        </w:rPr>
+        <w:t xml:space="preserve">Set Up Self-Service Updates…</w:t>
+      </w:r>
+      <w:r>
+        <w:t xml:space="preserve"> </w:t>
+      </w:r>
+      <w:r>
+        <w:t xml:space="preserve">in the update dialog.</w:t>
+      </w:r>
+    </w:p>
+    <w:p>
+      <w:pPr>
+        <w:pStyle w:val="Compact"/>
+        <w:numPr>
+          <w:ilvl w:val="0"/>
+          <w:numId w:val="1010"/>
+        </w:numPr>
+      </w:pPr>
+      <w:r>
+        <w:t xml:space="preserve">macOS shows the approval prompt, or DisplayHelp shows a dialog with</w:t>
+      </w:r>
+      <w:r>
+        <w:t xml:space="preserve"> </w:t>
+      </w:r>
+      <w:r>
+        <w:rPr>
+          <w:b/>
+          <w:bCs/>
+        </w:rPr>
+        <w:t xml:space="preserve">Open Login Items</w:t>
+      </w:r>
+      <w:r>
+        <w:t xml:space="preserve">. Either way, an administrator allows</w:t>
+      </w:r>
+      <w:r>
+        <w:t xml:space="preserve"> </w:t>
+      </w:r>
+      <w:r>
+        <w:rPr>
+          <w:b/>
+          <w:bCs/>
+        </w:rPr>
+        <w:t xml:space="preserve">DisplayHelp Updater</w:t>
+      </w:r>
+      <w:r>
+        <w:t xml:space="preserve"> </w:t>
+      </w:r>
+      <w:r>
+        <w:t xml:space="preserve">in System Settings › General › Login Items &amp; Extensions.</w:t>
+      </w:r>
+    </w:p>
+    <w:p>
+      <w:pPr>
+        <w:pStyle w:val="Compact"/>
+        <w:numPr>
+          <w:ilvl w:val="0"/>
+          <w:numId w:val="1010"/>
+        </w:numPr>
+      </w:pPr>
+      <w:r>
+        <w:t xml:space="preserve">Run</w:t>
+      </w:r>
+      <w:r>
+        <w:t xml:space="preserve"> </w:t>
+      </w:r>
+      <w:r>
+        <w:rPr>
+          <w:b/>
+          <w:bCs/>
+        </w:rPr>
+        <w:t xml:space="preserve">Check for Update…</w:t>
+      </w:r>
+      <w:r>
+        <w:t xml:space="preserve"> </w:t>
+      </w:r>
+      <w:r>
+        <w:t xml:space="preserve">again. The dialog now offers</w:t>
+      </w:r>
+      <w:r>
+        <w:t xml:space="preserve"> </w:t>
+      </w:r>
+      <w:r>
+        <w:rPr>
+          <w:b/>
+          <w:bCs/>
+        </w:rPr>
+        <w:t xml:space="preserve">Install</w:t>
+      </w:r>
+      <w:r>
+        <w:t xml:space="preserve">.</w:t>
+      </w:r>
+    </w:p>
+    <w:p>
+      <w:pPr>
+        <w:pStyle w:val="FirstParagraph"/>
+      </w:pPr>
+      <w:r>
+        <w:t xml:space="preserve">The approval is per Mac, not per user: after it, every account on that Mac, including standard accounts, can click Install. Until it is given, Download still works.</w:t>
+      </w:r>
+    </w:p>
+    <w:bookmarkEnd w:id="123"/>
+    <w:bookmarkStart w:id="124" w:name="approval-by-mdm-profile"/>
+    <w:p>
+      <w:pPr>
+        <w:pStyle w:val="Heading3"/>
+      </w:pPr>
+      <w:r>
+        <w:t xml:space="preserve">Approval by MDM profile</w:t>
+      </w:r>
+    </w:p>
+    <w:p>
+      <w:pPr>
+        <w:pStyle w:val="FirstParagraph"/>
+      </w:pPr>
+      <w:r>
+        <w:t xml:space="preserve">On managed Macs an MDM can grant the approval fleet-wide so nobody visits System Settings. The profile is in the</w:t>
+      </w:r>
+      <w:r>
+        <w:t xml:space="preserve"> </w:t>
+      </w:r>
+      <w:r>
+        <w:rPr>
+          <w:rStyle w:val="VerbatimChar"/>
+        </w:rPr>
+        <w:t xml:space="preserve">mdm</w:t>
+      </w:r>
+      <w:r>
+        <w:t xml:space="preserve"> </w:t>
+      </w:r>
+      <w:r>
+        <w:t xml:space="preserve">folder and attached to each release; the</w:t>
+      </w:r>
+      <w:r>
+        <w:t xml:space="preserve"> </w:t>
+      </w:r>
+      <w:hyperlink r:id="rId119">
+        <w:r>
+          <w:rPr>
+            <w:rStyle w:val="Hyperlink"/>
+          </w:rPr>
+          <w:t xml:space="preserve">rollout guide</w:t>
+        </w:r>
+      </w:hyperlink>
+      <w:r>
+        <w:t xml:space="preserve"> </w:t>
+      </w:r>
+      <w:r>
+        <w:t xml:space="preserve">explains how to deploy it. macOS only honours this profile when an MDM delivers it; installing the file by hand does nothing.</w:t>
+      </w:r>
+    </w:p>
+    <w:bookmarkEnd w:id="124"/>
+    <w:bookmarkStart w:id="125" w:name="homebrew"/>
+    <w:p>
+      <w:pPr>
+        <w:pStyle w:val="Heading3"/>
+      </w:pPr>
+      <w:r>
+        <w:t xml:space="preserve">Homebrew</w:t>
+      </w:r>
+    </w:p>
+    <w:p>
+      <w:pPr>
+        <w:pStyle w:val="SourceCode"/>
+      </w:pPr>
+      <w:r>
+        <w:rPr>
+          <w:rStyle w:val="ExtensionTok"/>
+        </w:rPr>
+        <w:t xml:space="preserve">brew</w:t>
+      </w:r>
+      <w:r>
+        <w:rPr>
+          <w:rStyle w:val="NormalTok"/>
+        </w:rPr>
+        <w:t xml:space="preserve"> upgrade </w:t>
+      </w:r>
+      <w:r>
+        <w:rPr>
+          <w:rStyle w:val="AttributeTok"/>
+        </w:rPr>
+        <w:t xml:space="preserve">--cask</w:t>
+      </w:r>
+      <w:r>
+        <w:rPr>
+          <w:rStyle w:val="NormalTok"/>
+        </w:rPr>
+        <w:t xml:space="preserve"> displayhelp</w:t>
+      </w:r>
+    </w:p>
+    <w:p>
+      <w:pPr>
+        <w:pStyle w:val="FirstParagraph"/>
+      </w:pPr>
+      <w:r>
+        <w:t xml:space="preserve">Homebrew downloads the release package, checks its SHA-256 and runs the installer, which asks for your password. Homebrew’s own record is updated only when Homebrew does the install; an in-app Install leaves it behind until the next</w:t>
+      </w:r>
+      <w:r>
+        <w:t xml:space="preserve"> </w:t>
+      </w:r>
+      <w:r>
+        <w:rPr>
+          <w:rStyle w:val="VerbatimChar"/>
+        </w:rPr>
+        <w:t xml:space="preserve">brew upgrade</w:t>
+      </w:r>
+      <w:r>
+        <w:t xml:space="preserve">, which is harmless.</w:t>
+      </w:r>
+    </w:p>
+    <w:bookmarkEnd w:id="125"/>
+    <w:bookmarkStart w:id="126" w:name="mdm-package-push"/>
+    <w:p>
+      <w:pPr>
+        <w:pStyle w:val="Heading3"/>
+      </w:pPr>
+      <w:r>
+        <w:t xml:space="preserve">MDM package push</w:t>
+      </w:r>
+    </w:p>
+    <w:p>
+      <w:pPr>
+        <w:pStyle w:val="FirstParagraph"/>
+      </w:pPr>
+      <w:r>
+        <w:t xml:space="preserve">IT deploys the new package through the management service the same way as the first install. The package quits any running copy, including copies in other users’ sessions, and restarts DisplayHelp for everyone signed in.</w:t>
+      </w:r>
+    </w:p>
+    <w:p>
+      <w:r>
+        <w:pict>
+          <v:rect style="width:0;height:1.5pt" o:hralign="center" o:hrstd="t" o:hr="t"/>
+        </w:pict>
+      </w:r>
+    </w:p>
+    <w:bookmarkEnd w:id="126"/>
+    <w:bookmarkEnd w:id="127"/>
+    <w:bookmarkStart w:id="131" w:name="the-connect-dialog"/>
     <w:p>
       <w:pPr>
         <w:pStyle w:val="Heading2"/>
@@ -7661,18 +8339,18 @@
           <wp:inline>
             <wp:extent cx="2476469" cy="3028912"/>
             <wp:effectExtent b="0" l="0" r="0" t="0"/>
-            <wp:docPr descr="DisplayHelp 0.6.6: First-connection prompt using a sample display" title="" id="123" name="Picture"/>
+            <wp:docPr descr="DisplayHelp 0.6.6: First-connection prompt using a sample display" title="" id="129" name="Picture"/>
             <a:graphic>
               <a:graphicData uri="http://schemas.openxmlformats.org/drawingml/2006/picture">
                 <pic:pic>
                   <pic:nvPicPr>
-                    <pic:cNvPr descr="/Users/helpdesk/Developer/GitHub/DisplayHelp/docs/images/first-connect.png" id="124" name="Picture"/>
+                    <pic:cNvPr descr="/Users/helpdesk/Developer/GitHub/DisplayHelp/docs/images/first-connect.png" id="130" name="Picture"/>
                     <pic:cNvPicPr>
                       <a:picLocks noChangeArrowheads="1" noChangeAspect="1"/>
                     </pic:cNvPicPr>
                   </pic:nvPicPr>
                   <pic:blipFill>
-                    <a:blip r:embed="rId122"/>
+                    <a:blip r:embed="rId128"/>
                     <a:stretch>
                       <a:fillRect/>
                     </a:stretch>
@@ -7729,7 +8407,7 @@
         <w:pStyle w:val="Compact"/>
         <w:numPr>
           <w:ilvl w:val="0"/>
-          <w:numId w:val="1009"/>
+          <w:numId w:val="1011"/>
         </w:numPr>
       </w:pPr>
       <w:r>
@@ -7748,7 +8426,7 @@
         <w:pStyle w:val="Compact"/>
         <w:numPr>
           <w:ilvl w:val="0"/>
-          <w:numId w:val="1009"/>
+          <w:numId w:val="1011"/>
         </w:numPr>
       </w:pPr>
       <w:r>
@@ -7767,7 +8445,7 @@
         <w:pStyle w:val="Compact"/>
         <w:numPr>
           <w:ilvl w:val="0"/>
-          <w:numId w:val="1009"/>
+          <w:numId w:val="1011"/>
         </w:numPr>
       </w:pPr>
       <w:r>
@@ -7795,8 +8473,8 @@
         <w:t xml:space="preserve">mirroring, Best for Display when extending.</w:t>
       </w:r>
     </w:p>
-    <w:bookmarkEnd w:id="125"/>
-    <w:bookmarkStart w:id="126" w:name="Xc6bbff7ca76b967f9df64a308f1bdb464fe71e0"/>
+    <w:bookmarkEnd w:id="131"/>
+    <w:bookmarkStart w:id="132" w:name="Xc6bbff7ca76b967f9df64a308f1bdb464fe71e0"/>
     <w:p>
       <w:pPr>
         <w:pStyle w:val="Heading2"/>
@@ -8156,8 +8834,8 @@
         <w:t xml:space="preserve">modes; explicitly loading a profile attempts the exact saved mode and verifies the result.</w:t>
       </w:r>
     </w:p>
-    <w:bookmarkEnd w:id="126"/>
-    <w:bookmarkStart w:id="127" w:name="keyboard-and-accessibility"/>
+    <w:bookmarkEnd w:id="132"/>
+    <w:bookmarkStart w:id="133" w:name="keyboard-and-accessibility"/>
     <w:p>
       <w:pPr>
         <w:pStyle w:val="Heading2"/>
@@ -8171,7 +8849,7 @@
         <w:pStyle w:val="Compact"/>
         <w:numPr>
           <w:ilvl w:val="0"/>
-          <w:numId w:val="1010"/>
+          <w:numId w:val="1012"/>
         </w:numPr>
       </w:pPr>
       <w:r>
@@ -8209,7 +8887,7 @@
         <w:pStyle w:val="Compact"/>
         <w:numPr>
           <w:ilvl w:val="0"/>
-          <w:numId w:val="1010"/>
+          <w:numId w:val="1012"/>
         </w:numPr>
       </w:pPr>
       <w:r>
@@ -8221,7 +8899,7 @@
         <w:pStyle w:val="Compact"/>
         <w:numPr>
           <w:ilvl w:val="0"/>
-          <w:numId w:val="1010"/>
+          <w:numId w:val="1012"/>
         </w:numPr>
       </w:pPr>
       <w:r>
@@ -8233,7 +8911,7 @@
         <w:pStyle w:val="Compact"/>
         <w:numPr>
           <w:ilvl w:val="0"/>
-          <w:numId w:val="1010"/>
+          <w:numId w:val="1012"/>
         </w:numPr>
       </w:pPr>
       <w:r>
@@ -8245,7 +8923,7 @@
         <w:pStyle w:val="Compact"/>
         <w:numPr>
           <w:ilvl w:val="0"/>
-          <w:numId w:val="1010"/>
+          <w:numId w:val="1012"/>
         </w:numPr>
       </w:pPr>
       <w:r>
@@ -8257,15 +8935,15 @@
         <w:pStyle w:val="Compact"/>
         <w:numPr>
           <w:ilvl w:val="0"/>
-          <w:numId w:val="1010"/>
+          <w:numId w:val="1012"/>
         </w:numPr>
       </w:pPr>
       <w:r>
         <w:t xml:space="preserve">The menu respects the system’s text size, light and dark appearance, and increased contrast.</w:t>
       </w:r>
     </w:p>
-    <w:bookmarkEnd w:id="127"/>
-    <w:bookmarkStart w:id="137" w:name="language"/>
+    <w:bookmarkEnd w:id="133"/>
+    <w:bookmarkStart w:id="143" w:name="language"/>
     <w:p>
       <w:pPr>
         <w:pStyle w:val="Heading2"/>
@@ -8597,7 +9275,7 @@
         </w:tc>
       </w:tr>
     </w:tbl>
-    <w:bookmarkStart w:id="128" w:name="follow-your-macs-language"/>
+    <w:bookmarkStart w:id="134" w:name="follow-your-macs-language"/>
     <w:p>
       <w:pPr>
         <w:pStyle w:val="Heading3"/>
@@ -8664,8 +9342,8 @@
         <w:t xml:space="preserve">For example, a Mac set to Italian uses Italian when DisplayHelp follows the system. An unsupported first language can fall back to another supported language in your preferred list.</w:t>
       </w:r>
     </w:p>
-    <w:bookmarkEnd w:id="128"/>
-    <w:bookmarkStart w:id="129" w:name="choose-a-language-inside-displayhelp"/>
+    <w:bookmarkEnd w:id="134"/>
+    <w:bookmarkStart w:id="135" w:name="choose-a-language-inside-displayhelp"/>
     <w:p>
       <w:pPr>
         <w:pStyle w:val="Heading3"/>
@@ -8679,7 +9357,7 @@
         <w:pStyle w:val="Compact"/>
         <w:numPr>
           <w:ilvl w:val="0"/>
-          <w:numId w:val="1011"/>
+          <w:numId w:val="1013"/>
         </w:numPr>
       </w:pPr>
       <w:r>
@@ -8691,7 +9369,7 @@
         <w:pStyle w:val="Compact"/>
         <w:numPr>
           <w:ilvl w:val="0"/>
-          <w:numId w:val="1011"/>
+          <w:numId w:val="1013"/>
         </w:numPr>
       </w:pPr>
       <w:r>
@@ -8719,7 +9397,7 @@
         <w:pStyle w:val="Compact"/>
         <w:numPr>
           <w:ilvl w:val="0"/>
-          <w:numId w:val="1011"/>
+          <w:numId w:val="1013"/>
         </w:numPr>
       </w:pPr>
       <w:r>
@@ -8731,7 +9409,7 @@
         <w:pStyle w:val="Compact"/>
         <w:numPr>
           <w:ilvl w:val="0"/>
-          <w:numId w:val="1011"/>
+          <w:numId w:val="1013"/>
         </w:numPr>
       </w:pPr>
       <w:r>
@@ -8791,8 +9469,8 @@
         <w:t xml:space="preserve">to return to the Mac’s preferences. The globe is temporarily unavailable while display changes, profile checks or fixes are running.</w:t>
       </w:r>
     </w:p>
-    <w:bookmarkEnd w:id="129"/>
-    <w:bookmarkStart w:id="136" w:name="macos-settings-versus-the-in-app-globe"/>
+    <w:bookmarkEnd w:id="135"/>
+    <w:bookmarkStart w:id="142" w:name="macos-settings-versus-the-in-app-globe"/>
     <w:p>
       <w:pPr>
         <w:pStyle w:val="Heading3"/>
@@ -8987,18 +9665,18 @@
           <wp:inline>
             <wp:extent cx="1428750" cy="3171825"/>
             <wp:effectExtent b="0" l="0" r="0" t="0"/>
-            <wp:docPr descr="DisplayHelp globe menu showing Follow System and all eleven language choices" title="" id="131" name="Picture"/>
+            <wp:docPr descr="DisplayHelp globe menu showing Follow System and all eleven language choices" title="" id="137" name="Picture"/>
             <a:graphic>
               <a:graphicData uri="http://schemas.openxmlformats.org/drawingml/2006/picture">
                 <pic:pic>
                   <pic:nvPicPr>
-                    <pic:cNvPr descr="/Users/helpdesk/Developer/GitHub/DisplayHelp/docs/images/language-menu.png" id="132" name="Picture"/>
+                    <pic:cNvPr descr="/Users/helpdesk/Developer/GitHub/DisplayHelp/docs/images/language-menu.png" id="138" name="Picture"/>
                     <pic:cNvPicPr>
                       <a:picLocks noChangeArrowheads="1" noChangeAspect="1"/>
                     </pic:cNvPicPr>
                   </pic:nvPicPr>
                   <pic:blipFill>
-                    <a:blip r:embed="rId130"/>
+                    <a:blip r:embed="rId136"/>
                     <a:stretch>
                       <a:fillRect/>
                     </a:stretch>
@@ -9042,18 +9720,18 @@
           <wp:inline>
             <wp:extent cx="2476469" cy="2228822"/>
             <wp:effectExtent b="0" l="0" r="0" t="0"/>
-            <wp:docPr descr="Restart DisplayHelp to apply the app-only language selection, or choose Later" title="" id="134" name="Picture"/>
+            <wp:docPr descr="Restart DisplayHelp to apply the app-only language selection, or choose Later" title="" id="140" name="Picture"/>
             <a:graphic>
               <a:graphicData uri="http://schemas.openxmlformats.org/drawingml/2006/picture">
                 <pic:pic>
                   <pic:nvPicPr>
-                    <pic:cNvPr descr="/Users/helpdesk/Developer/GitHub/DisplayHelp/docs/images/language-confirmation.png" id="135" name="Picture"/>
+                    <pic:cNvPr descr="/Users/helpdesk/Developer/GitHub/DisplayHelp/docs/images/language-confirmation.png" id="141" name="Picture"/>
                     <pic:cNvPicPr>
                       <a:picLocks noChangeArrowheads="1" noChangeAspect="1"/>
                     </pic:cNvPicPr>
                   </pic:nvPicPr>
                   <pic:blipFill>
-                    <a:blip r:embed="rId133"/>
+                    <a:blip r:embed="rId139"/>
                     <a:stretch>
                       <a:fillRect/>
                     </a:stretch>
@@ -9113,10 +9791,10 @@
         <w:t xml:space="preserve">for Traditional Chinese and Arabic. Translation terminology has been checked against Apple documentation; independent native-speaker review remains pending.</w:t>
       </w:r>
     </w:p>
-    <w:bookmarkEnd w:id="136"/>
-    <w:bookmarkEnd w:id="137"/>
-    <w:bookmarkEnd w:id="138"/>
-    <w:bookmarkStart w:id="144" w:name="faq"/>
+    <w:bookmarkEnd w:id="142"/>
+    <w:bookmarkEnd w:id="143"/>
+    <w:bookmarkEnd w:id="144"/>
+    <w:bookmarkStart w:id="150" w:name="faq"/>
     <w:p>
       <w:pPr>
         <w:pStyle w:val="Heading1"/>
@@ -9754,7 +10432,7 @@
       <w:r>
         <w:t xml:space="preserve"> </w:t>
       </w:r>
-      <w:hyperlink r:id="rId139">
+      <w:hyperlink r:id="rId145">
         <w:r>
           <w:rPr>
             <w:rStyle w:val="Hyperlink"/>
@@ -9891,7 +10569,7 @@
       <w:r>
         <w:t xml:space="preserve"> </w:t>
       </w:r>
-      <w:hyperlink r:id="rId140">
+      <w:hyperlink r:id="rId146">
         <w:r>
           <w:rPr>
             <w:rStyle w:val="Hyperlink"/>
@@ -10431,7 +11109,7 @@
       <w:r>
         <w:t xml:space="preserve"> </w:t>
       </w:r>
-      <w:hyperlink r:id="rId141">
+      <w:hyperlink r:id="rId147">
         <w:r>
           <w:rPr>
             <w:rStyle w:val="Hyperlink"/>
@@ -10733,7 +11411,7 @@
         <w:t xml:space="preserve">Place acts on the card you opened. Choosing “Built-in Display left of SAMSUNG” puts the laptop on the left and SAMSUNG on the right. To put SAMSUNG left of the laptop, open Place… on SAMSUNG’s card and choose it left of Built-in Display. The visible placement, alignment and rotation describe the actual setup.</w:t>
       </w:r>
     </w:p>
-    <w:bookmarkStart w:id="143" w:name="X659270d6f81ca5d909cf0b22b18d20410103a55"/>
+    <w:bookmarkStart w:id="149" w:name="X659270d6f81ca5d909cf0b22b18d20410103a55"/>
     <w:p>
       <w:pPr>
         <w:pStyle w:val="Heading2"/>
@@ -10776,7 +11454,7 @@
       <w:r>
         <w:t xml:space="preserve"> </w:t>
       </w:r>
-      <w:hyperlink r:id="rId142">
+      <w:hyperlink r:id="rId148">
         <w:r>
           <w:rPr>
             <w:rStyle w:val="Hyperlink"/>
@@ -10788,9 +11466,9 @@
         <w:t xml:space="preserve">.</w:t>
       </w:r>
     </w:p>
-    <w:bookmarkEnd w:id="143"/>
-    <w:bookmarkEnd w:id="144"/>
-    <w:bookmarkStart w:id="193" w:name="troubleshooting"/>
+    <w:bookmarkEnd w:id="149"/>
+    <w:bookmarkEnd w:id="150"/>
+    <w:bookmarkStart w:id="199" w:name="troubleshooting"/>
     <w:p>
       <w:pPr>
         <w:pStyle w:val="Heading1"/>
@@ -10815,7 +11493,7 @@
       <w:r>
         <w:t xml:space="preserve"> </w:t>
       </w:r>
-      <w:hyperlink r:id="rId145">
+      <w:hyperlink r:id="rId151">
         <w:r>
           <w:rPr>
             <w:rStyle w:val="Hyperlink"/>
@@ -10836,7 +11514,7 @@
         <w:t xml:space="preserve">modes vary by Mac, cable and port.</w:t>
       </w:r>
     </w:p>
-    <w:bookmarkStart w:id="146" w:name="contents-1"/>
+    <w:bookmarkStart w:id="152" w:name="contents-1"/>
     <w:p>
       <w:pPr>
         <w:pStyle w:val="Heading2"/>
@@ -10850,7 +11528,7 @@
         <w:pStyle w:val="Compact"/>
         <w:numPr>
           <w:ilvl w:val="0"/>
-          <w:numId w:val="1012"/>
+          <w:numId w:val="1014"/>
         </w:numPr>
       </w:pPr>
       <w:hyperlink w:anchor="picture-and-layout">
@@ -10867,7 +11545,7 @@
         <w:pStyle w:val="Compact"/>
         <w:numPr>
           <w:ilvl w:val="0"/>
-          <w:numId w:val="1012"/>
+          <w:numId w:val="1014"/>
         </w:numPr>
       </w:pPr>
       <w:hyperlink w:anchor="connection">
@@ -10884,7 +11562,7 @@
         <w:pStyle w:val="Compact"/>
         <w:numPr>
           <w:ilvl w:val="0"/>
-          <w:numId w:val="1012"/>
+          <w:numId w:val="1014"/>
         </w:numPr>
       </w:pPr>
       <w:hyperlink w:anchor="controls-and-buttons">
@@ -10901,7 +11579,7 @@
         <w:pStyle w:val="Compact"/>
         <w:numPr>
           <w:ilvl w:val="0"/>
-          <w:numId w:val="1012"/>
+          <w:numId w:val="1014"/>
         </w:numPr>
       </w:pPr>
       <w:hyperlink w:anchor="errors-in-recent-events">
@@ -10918,7 +11596,7 @@
         <w:pStyle w:val="Compact"/>
         <w:numPr>
           <w:ilvl w:val="0"/>
-          <w:numId w:val="1012"/>
+          <w:numId w:val="1014"/>
         </w:numPr>
       </w:pPr>
       <w:hyperlink w:anchor="the-app-itself">
@@ -10935,7 +11613,7 @@
         <w:pStyle w:val="Compact"/>
         <w:numPr>
           <w:ilvl w:val="0"/>
-          <w:numId w:val="1012"/>
+          <w:numId w:val="1014"/>
         </w:numPr>
       </w:pPr>
       <w:hyperlink w:anchor="collecting-diagnostics-for-the-helpdesk">
@@ -10954,8 +11632,8 @@
         </w:pict>
       </w:r>
     </w:p>
-    <w:bookmarkEnd w:id="146"/>
-    <w:bookmarkStart w:id="153" w:name="picture-and-layout"/>
+    <w:bookmarkEnd w:id="152"/>
+    <w:bookmarkStart w:id="159" w:name="picture-and-layout"/>
     <w:p>
       <w:pPr>
         <w:pStyle w:val="Heading2"/>
@@ -10964,7 +11642,7 @@
         <w:t xml:space="preserve">Picture and layout</w:t>
       </w:r>
     </w:p>
-    <w:bookmarkStart w:id="147" w:name="X82e123150de438f1c200291ce92a1676b84fa91"/>
+    <w:bookmarkStart w:id="153" w:name="X82e123150de438f1c200291ce92a1676b84fa91"/>
     <w:p>
       <w:pPr>
         <w:pStyle w:val="Heading3"/>
@@ -11026,8 +11704,8 @@
         <w:t xml:space="preserve">restarts the Dock after any display change that ends mirrored, once the burst of changes settles.</w:t>
       </w:r>
     </w:p>
-    <w:bookmarkEnd w:id="147"/>
-    <w:bookmarkStart w:id="148" w:name="Xfb0234130da404ecddbe50f67bb27c1554369e4"/>
+    <w:bookmarkEnd w:id="153"/>
+    <w:bookmarkStart w:id="154" w:name="Xfb0234130da404ecddbe50f67bb27c1554369e4"/>
     <w:p>
       <w:pPr>
         <w:pStyle w:val="Heading3"/>
@@ -11128,8 +11806,8 @@
         <w:t xml:space="preserve">wait for the confirmation deadline to revert instead of keeping it.</w:t>
       </w:r>
     </w:p>
-    <w:bookmarkEnd w:id="148"/>
-    <w:bookmarkStart w:id="149" w:name="everything-on-the-tv-is-tiny"/>
+    <w:bookmarkEnd w:id="154"/>
+    <w:bookmarkStart w:id="155" w:name="everything-on-the-tv-is-tiny"/>
     <w:p>
       <w:pPr>
         <w:pStyle w:val="Heading3"/>
@@ -11191,8 +11869,8 @@
         <w:t xml:space="preserve">1920×1080 HiDPI, which is sharp and readable.</w:t>
       </w:r>
     </w:p>
-    <w:bookmarkEnd w:id="149"/>
-    <w:bookmarkStart w:id="150" w:name="X5f2d60a8f5ce5bb701abc8287569eab4a33a7a1"/>
+    <w:bookmarkEnd w:id="155"/>
+    <w:bookmarkStart w:id="156" w:name="X5f2d60a8f5ce5bb701abc8287569eab4a33a7a1"/>
     <w:p>
       <w:pPr>
         <w:pStyle w:val="Heading3"/>
@@ -11273,8 +11951,8 @@
         <w:t xml:space="preserve">identical.</w:t>
       </w:r>
     </w:p>
-    <w:bookmarkEnd w:id="150"/>
-    <w:bookmarkStart w:id="151" w:name="the-laptop-and-tv-are-on-different-sizes"/>
+    <w:bookmarkEnd w:id="156"/>
+    <w:bookmarkStart w:id="157" w:name="the-laptop-and-tv-are-on-different-sizes"/>
     <w:p>
       <w:pPr>
         <w:pStyle w:val="Heading3"/>
@@ -11336,8 +12014,8 @@
         <w:t xml:space="preserve">was not running. The app re-mirrors the set, which makes macOS put the laptop back on the TV’s size.</w:t>
       </w:r>
     </w:p>
-    <w:bookmarkEnd w:id="151"/>
-    <w:bookmarkStart w:id="152" w:name="X6dfc21217b62a1ebab5e2e08781264a2700369e"/>
+    <w:bookmarkEnd w:id="157"/>
+    <w:bookmarkStart w:id="158" w:name="X6dfc21217b62a1ebab5e2e08781264a2700369e"/>
     <w:p>
       <w:pPr>
         <w:pStyle w:val="Heading3"/>
@@ -11396,9 +12074,9 @@
         <w:t xml:space="preserve">.</w:t>
       </w:r>
     </w:p>
-    <w:bookmarkEnd w:id="152"/>
-    <w:bookmarkEnd w:id="153"/>
-    <w:bookmarkStart w:id="158" w:name="connection"/>
+    <w:bookmarkEnd w:id="158"/>
+    <w:bookmarkEnd w:id="159"/>
+    <w:bookmarkStart w:id="164" w:name="connection"/>
     <w:p>
       <w:pPr>
         <w:pStyle w:val="Heading2"/>
@@ -11407,7 +12085,7 @@
         <w:t xml:space="preserve">Connection</w:t>
       </w:r>
     </w:p>
-    <w:bookmarkStart w:id="154" w:name="Xbf17b323036102cb0637ec4097597e7144c58a4"/>
+    <w:bookmarkStart w:id="160" w:name="Xbf17b323036102cb0637ec4097597e7144c58a4"/>
     <w:p>
       <w:pPr>
         <w:pStyle w:val="Heading3"/>
@@ -11538,8 +12216,8 @@
         <w:t xml:space="preserve">reconnect; it never disconnects anything.</w:t>
       </w:r>
     </w:p>
-    <w:bookmarkEnd w:id="154"/>
-    <w:bookmarkStart w:id="155" w:name="Xd7137ed43a1016018c8568ef1ae65dba0c487dc"/>
+    <w:bookmarkEnd w:id="160"/>
+    <w:bookmarkStart w:id="161" w:name="Xd7137ed43a1016018c8568ef1ae65dba0c487dc"/>
     <w:p>
       <w:pPr>
         <w:pStyle w:val="Heading3"/>
@@ -11572,8 +12250,8 @@
         <w:t xml:space="preserve">saved data was removed by the uninstaller with purge on. Answer once and it is remembered again.</w:t>
       </w:r>
     </w:p>
-    <w:bookmarkEnd w:id="155"/>
-    <w:bookmarkStart w:id="156" w:name="X06ef9e1fb6197e69548f8b3ba27193891f41d25"/>
+    <w:bookmarkEnd w:id="161"/>
+    <w:bookmarkStart w:id="162" w:name="X06ef9e1fb6197e69548f8b3ba27193891f41d25"/>
     <w:p>
       <w:pPr>
         <w:pStyle w:val="Heading3"/>
@@ -11624,8 +12302,8 @@
         <w:t xml:space="preserve">display’s name.</w:t>
       </w:r>
     </w:p>
-    <w:bookmarkEnd w:id="156"/>
-    <w:bookmarkStart w:id="157" w:name="only-the-built-in-display-is-found"/>
+    <w:bookmarkEnd w:id="162"/>
+    <w:bookmarkStart w:id="163" w:name="only-the-built-in-display-is-found"/>
     <w:p>
       <w:pPr>
         <w:pStyle w:val="Heading3"/>
@@ -11671,9 +12349,9 @@
         <w:t xml:space="preserve">Mac’s own port.</w:t>
       </w:r>
     </w:p>
-    <w:bookmarkEnd w:id="157"/>
-    <w:bookmarkEnd w:id="158"/>
-    <w:bookmarkStart w:id="175" w:name="controls-and-buttons"/>
+    <w:bookmarkEnd w:id="163"/>
+    <w:bookmarkEnd w:id="164"/>
+    <w:bookmarkStart w:id="181" w:name="controls-and-buttons"/>
     <w:p>
       <w:pPr>
         <w:pStyle w:val="Heading2"/>
@@ -11682,7 +12360,7 @@
         <w:t xml:space="preserve">Controls and buttons</w:t>
       </w:r>
     </w:p>
-    <w:bookmarkStart w:id="159" w:name="X189378a9b5c4c2dd79bd2dcb3196528111c6a3b"/>
+    <w:bookmarkStart w:id="165" w:name="X189378a9b5c4c2dd79bd2dcb3196528111c6a3b"/>
     <w:p>
       <w:pPr>
         <w:pStyle w:val="Heading3"/>
@@ -11715,8 +12393,8 @@
         <w:t xml:space="preserve">The status icon can still be the grey ⓘ when the current refresh rate is below 50 Hz.</w:t>
       </w:r>
     </w:p>
-    <w:bookmarkEnd w:id="159"/>
-    <w:bookmarkStart w:id="160" w:name="X34be2b1480a8d411d8a0e7512016d5fcd4943ca"/>
+    <w:bookmarkEnd w:id="165"/>
+    <w:bookmarkStart w:id="166" w:name="X34be2b1480a8d411d8a0e7512016d5fcd4943ca"/>
     <w:p>
       <w:pPr>
         <w:pStyle w:val="Heading3"/>
@@ -11825,8 +12503,8 @@
         <w:t xml:space="preserve">Recommendations prefer 50 Hz or better, but fall back when none is available.</w:t>
       </w:r>
     </w:p>
-    <w:bookmarkEnd w:id="160"/>
-    <w:bookmarkStart w:id="161" w:name="X44969330943e9cfead843a705f2ee9898e19689"/>
+    <w:bookmarkEnd w:id="166"/>
+    <w:bookmarkStart w:id="167" w:name="X44969330943e9cfead843a705f2ee9898e19689"/>
     <w:p>
       <w:pPr>
         <w:pStyle w:val="Heading3"/>
@@ -11893,8 +12571,8 @@
         <w:t xml:space="preserve">also requires an exact, unambiguous set and must be enabled explicitly.</w:t>
       </w:r>
     </w:p>
-    <w:bookmarkEnd w:id="161"/>
-    <w:bookmarkStart w:id="162" w:name="Xed348068975c5041e0b91f43ed9499efff73969"/>
+    <w:bookmarkEnd w:id="167"/>
+    <w:bookmarkStart w:id="168" w:name="Xed348068975c5041e0b91f43ed9499efff73969"/>
     <w:p>
       <w:pPr>
         <w:pStyle w:val="Heading3"/>
@@ -11979,8 +12657,8 @@
         <w:t xml:space="preserve">yet; renaming monitors or resetting app data will not resolve the ambiguity.</w:t>
       </w:r>
     </w:p>
-    <w:bookmarkEnd w:id="162"/>
-    <w:bookmarkStart w:id="163" w:name="X878a2dd9260edfb41d38e8e1459534d630bb9b6"/>
+    <w:bookmarkEnd w:id="168"/>
+    <w:bookmarkStart w:id="169" w:name="X878a2dd9260edfb41d38e8e1459534d630bb9b6"/>
     <w:p>
       <w:pPr>
         <w:pStyle w:val="Heading3"/>
@@ -12080,7 +12758,7 @@
       <w:r>
         <w:t xml:space="preserve"> </w:t>
       </w:r>
-      <w:hyperlink r:id="rId139">
+      <w:hyperlink r:id="rId145">
         <w:r>
           <w:rPr>
             <w:rStyle w:val="Hyperlink"/>
@@ -12092,8 +12770,8 @@
         <w:t xml:space="preserve">.</w:t>
       </w:r>
     </w:p>
-    <w:bookmarkEnd w:id="163"/>
-    <w:bookmarkStart w:id="164" w:name="X6213711d1bf40f750ef4ad4626da1a1dc5b9f77"/>
+    <w:bookmarkEnd w:id="169"/>
+    <w:bookmarkStart w:id="170" w:name="X6213711d1bf40f750ef4ad4626da1a1dc5b9f77"/>
     <w:p>
       <w:pPr>
         <w:pStyle w:val="Heading3"/>
@@ -12132,8 +12810,8 @@
         <w:t xml:space="preserve">Closing the menu does not dismiss the floating confirmation window.</w:t>
       </w:r>
     </w:p>
-    <w:bookmarkEnd w:id="164"/>
-    <w:bookmarkStart w:id="165" w:name="revert-could-not-restore-every-setting"/>
+    <w:bookmarkEnd w:id="170"/>
+    <w:bookmarkStart w:id="171" w:name="revert-could-not-restore-every-setting"/>
     <w:p>
       <w:pPr>
         <w:pStyle w:val="Heading3"/>
@@ -12204,8 +12882,8 @@
         <w:t xml:space="preserve">previous reconnect preferences and reports incomplete recovery rather than treating it as success.</w:t>
       </w:r>
     </w:p>
-    <w:bookmarkEnd w:id="165"/>
-    <w:bookmarkStart w:id="166" w:name="favorite-shortcuts-do-nothing"/>
+    <w:bookmarkEnd w:id="171"/>
+    <w:bookmarkStart w:id="172" w:name="favorite-shortcuts-do-nothing"/>
     <w:p>
       <w:pPr>
         <w:pStyle w:val="Heading3"/>
@@ -12342,8 +13020,8 @@
         <w:t xml:space="preserve">applying anything.</w:t>
       </w:r>
     </w:p>
-    <w:bookmarkEnd w:id="166"/>
-    <w:bookmarkStart w:id="167" w:name="the-profile-library-cannot-be-loaded"/>
+    <w:bookmarkEnd w:id="172"/>
+    <w:bookmarkStart w:id="173" w:name="the-profile-library-cannot-be-loaded"/>
     <w:p>
       <w:pPr>
         <w:pStyle w:val="Heading3"/>
@@ -12450,8 +13128,8 @@
         <w:t xml:space="preserve">until recovery so the unreadable original cannot silently be overwritten.</w:t>
       </w:r>
     </w:p>
-    <w:bookmarkEnd w:id="167"/>
-    <w:bookmarkStart w:id="168" w:name="reconnect-preferences-could-not-be-saved"/>
+    <w:bookmarkEnd w:id="173"/>
+    <w:bookmarkStart w:id="174" w:name="reconnect-preferences-could-not-be-saved"/>
     <w:p>
       <w:pPr>
         <w:pStyle w:val="Heading3"/>
@@ -12521,8 +13199,8 @@
         <w:t xml:space="preserve">error does not prove the hardware change failed, but that change may not be recalled on reconnect.</w:t>
       </w:r>
     </w:p>
-    <w:bookmarkEnd w:id="168"/>
-    <w:bookmarkStart w:id="169" w:name="Xe0ceaf7c29d5e5d05459c0fea4bc9595c94c02e"/>
+    <w:bookmarkEnd w:id="174"/>
+    <w:bookmarkStart w:id="175" w:name="Xe0ceaf7c29d5e5d05459c0fea4bc9595c94c02e"/>
     <w:p>
       <w:pPr>
         <w:pStyle w:val="Heading3"/>
@@ -12595,8 +13273,8 @@
         <w:t xml:space="preserve">controls can still work.</w:t>
       </w:r>
     </w:p>
-    <w:bookmarkEnd w:id="169"/>
-    <w:bookmarkStart w:id="170" w:name="hdcp-shows-unavailable"/>
+    <w:bookmarkEnd w:id="175"/>
+    <w:bookmarkStart w:id="176" w:name="hdcp-shows-unavailable"/>
     <w:p>
       <w:pPr>
         <w:pStyle w:val="Heading3"/>
@@ -12711,8 +13389,8 @@
         <w:t xml:space="preserve">for macOS, or no answer within three seconds. It is not a statement about the display.</w:t>
       </w:r>
     </w:p>
-    <w:bookmarkEnd w:id="170"/>
-    <w:bookmarkStart w:id="171" w:name="hdcp-shows-unprotected-or-negotiating"/>
+    <w:bookmarkEnd w:id="176"/>
+    <w:bookmarkStart w:id="177" w:name="hdcp-shows-unprotected-or-negotiating"/>
     <w:p>
       <w:pPr>
         <w:pStyle w:val="Heading3"/>
@@ -12792,8 +13470,8 @@
         <w:t xml:space="preserve">on DisplayPort connections the topology sentence reports whether a repeater is present and, for an HDCP 2 repeater, any limit flags it sets.</w:t>
       </w:r>
     </w:p>
-    <w:bookmarkEnd w:id="171"/>
-    <w:bookmarkStart w:id="172" w:name="no-rotation-or-underscan-row"/>
+    <w:bookmarkEnd w:id="177"/>
+    <w:bookmarkStart w:id="178" w:name="no-rotation-or-underscan-row"/>
     <w:p>
       <w:pPr>
         <w:pStyle w:val="Heading3"/>
@@ -12832,8 +13510,8 @@
         <w:t xml:space="preserve">monitor that can swivel exposes software rotation through this connection.</w:t>
       </w:r>
     </w:p>
-    <w:bookmarkEnd w:id="172"/>
-    <w:bookmarkStart w:id="173" w:name="X8d7085585af9f1b47330aa5031ccc1f3421da57"/>
+    <w:bookmarkEnd w:id="178"/>
+    <w:bookmarkStart w:id="179" w:name="X8d7085585af9f1b47330aa5031ccc1f3421da57"/>
     <w:p>
       <w:pPr>
         <w:pStyle w:val="Heading3"/>
@@ -12872,8 +13550,8 @@
         <w:t xml:space="preserve">Settings; the app will keep it and show it in the picker as the current size.</w:t>
       </w:r>
     </w:p>
-    <w:bookmarkEnd w:id="173"/>
-    <w:bookmarkStart w:id="174" w:name="a-custom-fix-does-not-appear"/>
+    <w:bookmarkEnd w:id="179"/>
+    <w:bookmarkStart w:id="180" w:name="a-custom-fix-does-not-appear"/>
     <w:p>
       <w:pPr>
         <w:pStyle w:val="Heading3"/>
@@ -12979,9 +13657,9 @@
         <w:t xml:space="preserve">line.</w:t>
       </w:r>
     </w:p>
-    <w:bookmarkEnd w:id="174"/>
-    <w:bookmarkEnd w:id="175"/>
-    <w:bookmarkStart w:id="180" w:name="errors-in-recent-events"/>
+    <w:bookmarkEnd w:id="180"/>
+    <w:bookmarkEnd w:id="181"/>
+    <w:bookmarkStart w:id="186" w:name="errors-in-recent-events"/>
     <w:p>
       <w:pPr>
         <w:pStyle w:val="Heading2"/>
@@ -12990,7 +13668,7 @@
         <w:t xml:space="preserve">Errors in Recent Events</w:t>
       </w:r>
     </w:p>
-    <w:bookmarkStart w:id="176" w:name="applyfailed-with-cgerror-1001"/>
+    <w:bookmarkStart w:id="182" w:name="applyfailed-with-cgerror-1001"/>
     <w:p>
       <w:pPr>
         <w:pStyle w:val="Heading3"/>
@@ -13051,8 +13729,8 @@
         <w:t xml:space="preserve">.</w:t>
       </w:r>
     </w:p>
-    <w:bookmarkEnd w:id="176"/>
-    <w:bookmarkStart w:id="177" w:name="applyfailed-with-cgerror-1007"/>
+    <w:bookmarkEnd w:id="182"/>
+    <w:bookmarkStart w:id="183" w:name="applyfailed-with-cgerror-1007"/>
     <w:p>
       <w:pPr>
         <w:pStyle w:val="Heading3"/>
@@ -13094,8 +13772,8 @@
         <w:t xml:space="preserve">a reconnect clears it.</w:t>
       </w:r>
     </w:p>
-    <w:bookmarkEnd w:id="177"/>
-    <w:bookmarkStart w:id="178" w:name="applyfailed-with-preset-mode-unavailable"/>
+    <w:bookmarkEnd w:id="183"/>
+    <w:bookmarkStart w:id="184" w:name="applyfailed-with-preset-mode-unavailable"/>
     <w:p>
       <w:pPr>
         <w:pStyle w:val="Heading3"/>
@@ -13143,8 +13821,8 @@
         <w:t xml:space="preserve">size the picker now hides). Pick a size once and the preset is replaced.</w:t>
       </w:r>
     </w:p>
-    <w:bookmarkEnd w:id="178"/>
-    <w:bookmarkStart w:id="179" w:name="scriptfailed"/>
+    <w:bookmarkEnd w:id="184"/>
+    <w:bookmarkStart w:id="185" w:name="scriptfailed"/>
     <w:p>
       <w:pPr>
         <w:pStyle w:val="Heading3"/>
@@ -13174,9 +13852,9 @@
         <w:t xml:space="preserve">A fix script exited non-zero. The detail holds the exit code and the last line of its output.</w:t>
       </w:r>
     </w:p>
-    <w:bookmarkEnd w:id="179"/>
-    <w:bookmarkEnd w:id="180"/>
-    <w:bookmarkStart w:id="184" w:name="the-app-itself"/>
+    <w:bookmarkEnd w:id="185"/>
+    <w:bookmarkEnd w:id="186"/>
+    <w:bookmarkStart w:id="190" w:name="the-app-itself"/>
     <w:p>
       <w:pPr>
         <w:pStyle w:val="Heading2"/>
@@ -13185,7 +13863,7 @@
         <w:t xml:space="preserve">The app itself</w:t>
       </w:r>
     </w:p>
-    <w:bookmarkStart w:id="181" w:name="X9b1f4ba64c8cc24cd6a73bb963e8fd140d5a5ad"/>
+    <w:bookmarkStart w:id="187" w:name="X9b1f4ba64c8cc24cd6a73bb963e8fd140d5a5ad"/>
     <w:p>
       <w:pPr>
         <w:pStyle w:val="Heading3"/>
@@ -13238,8 +13916,8 @@
         <w:t xml:space="preserve">WindowServer’s own display database is corrupt. The reset deletes it and macOS rebuilds it.</w:t>
       </w:r>
     </w:p>
-    <w:bookmarkEnd w:id="181"/>
-    <w:bookmarkStart w:id="182" w:name="X62c7b447ec07287f68a9b85ae335e30731aac00"/>
+    <w:bookmarkEnd w:id="187"/>
+    <w:bookmarkStart w:id="188" w:name="X62c7b447ec07287f68a9b85ae335e30731aac00"/>
     <w:p>
       <w:pPr>
         <w:pStyle w:val="Heading3"/>
@@ -13356,8 +14034,8 @@
         <w:t xml:space="preserve">in Console.</w:t>
       </w:r>
     </w:p>
-    <w:bookmarkEnd w:id="182"/>
-    <w:bookmarkStart w:id="183" w:name="the-icon-is-not-in-the-menu-bar"/>
+    <w:bookmarkEnd w:id="188"/>
+    <w:bookmarkStart w:id="189" w:name="the-icon-is-not-in-the-menu-bar"/>
     <w:p>
       <w:pPr>
         <w:pStyle w:val="Heading3"/>
@@ -13396,9 +14074,9 @@
         <w:t xml:space="preserve">. If it no longer starts at login, turn DisplayHelp back on in System Settings › General › Login Items › Allow in the Background.</w:t>
       </w:r>
     </w:p>
-    <w:bookmarkEnd w:id="183"/>
-    <w:bookmarkEnd w:id="184"/>
-    <w:bookmarkStart w:id="186" w:name="collecting-diagnostics-for-the-helpdesk"/>
+    <w:bookmarkEnd w:id="189"/>
+    <w:bookmarkEnd w:id="190"/>
+    <w:bookmarkStart w:id="192" w:name="collecting-diagnostics-for-the-helpdesk"/>
     <w:p>
       <w:pPr>
         <w:pStyle w:val="Heading2"/>
@@ -13835,7 +14513,7 @@
         <w:t xml:space="preserve">questions.</w:t>
       </w:r>
     </w:p>
-    <w:bookmarkStart w:id="185" w:name="X5e31aa226ff031c45db4ee0abd5206d87407bf1"/>
+    <w:bookmarkStart w:id="191" w:name="X5e31aa226ff031c45db4ee0abd5206d87407bf1"/>
     <w:p>
       <w:pPr>
         <w:pStyle w:val="Heading3"/>
@@ -14227,9 +14905,9 @@
         <w:t xml:space="preserve">that resets macOS display configuration.</w:t>
       </w:r>
     </w:p>
-    <w:bookmarkEnd w:id="185"/>
-    <w:bookmarkEnd w:id="186"/>
-    <w:bookmarkStart w:id="187" w:name="X6be06324594e8636178a21782f04ed856eaf899"/>
+    <w:bookmarkEnd w:id="191"/>
+    <w:bookmarkEnd w:id="192"/>
+    <w:bookmarkStart w:id="193" w:name="X6be06324594e8636178a21782f04ed856eaf899"/>
     <w:p>
       <w:pPr>
         <w:pStyle w:val="Heading2"/>
@@ -14276,8 +14954,8 @@
         <w:t xml:space="preserve">change if the installer reports that DisplayHelp could not close, quit the app, then rerun the installer.</w:t>
       </w:r>
     </w:p>
-    <w:bookmarkEnd w:id="187"/>
-    <w:bookmarkStart w:id="188" w:name="the-menu-looks-too-short"/>
+    <w:bookmarkEnd w:id="193"/>
+    <w:bookmarkStart w:id="194" w:name="the-menu-looks-too-short"/>
     <w:p>
       <w:pPr>
         <w:pStyle w:val="Heading2"/>
@@ -14306,8 +14984,8 @@
         <w:t xml:space="preserve">labeled with both screen numbers because both screens share a desktop.</w:t>
       </w:r>
     </w:p>
-    <w:bookmarkEnd w:id="188"/>
-    <w:bookmarkStart w:id="189" w:name="Xf9170cca88befcfcd23a9345b9e4a973df9f439"/>
+    <w:bookmarkEnd w:id="194"/>
+    <w:bookmarkStart w:id="195" w:name="Xf9170cca88befcfcd23a9345b9e4a973df9f439"/>
     <w:p>
       <w:pPr>
         <w:pStyle w:val="Heading2"/>
@@ -14337,8 +15015,8 @@
         <w:t xml:space="preserve">. Use Extend for independent desktops. Labels disappear after five seconds or a display-configuration change; click Identify Displays again to show them. The button appears beneath Screen Layout when an external display is detected. It does not request screen-recording access or capture desktop content.</w:t>
       </w:r>
     </w:p>
-    <w:bookmarkEnd w:id="189"/>
-    <w:bookmarkStart w:id="191" w:name="X5adf6dd4b75cee570ca37404475ada2ad2e72b3"/>
+    <w:bookmarkEnd w:id="195"/>
+    <w:bookmarkStart w:id="197" w:name="X5adf6dd4b75cee570ca37404475ada2ad2e72b3"/>
     <w:p>
       <w:pPr>
         <w:pStyle w:val="Heading2"/>
@@ -14387,7 +15065,7 @@
         <w:t xml:space="preserve">If an audio device changes while you adjust it, the app refuses the stale adjustment and asks you to use the newly selected output. Failed writes show the current readback and an explanation. No saved display profile is overwritten by an output-volume adjustment.</w:t>
       </w:r>
     </w:p>
-    <w:bookmarkStart w:id="190" w:name="placement-appears-reversed"/>
+    <w:bookmarkStart w:id="196" w:name="placement-appears-reversed"/>
     <w:p>
       <w:pPr>
         <w:pStyle w:val="Heading3"/>
@@ -14433,9 +15111,9 @@
         <w:t xml:space="preserve">, then alignment. Left on the built-in card means the opposite relationship. Check the visible readout and preview, then Keep Changes. For a failed move, share Copy Diagnostics immediately so its latest 20 events include the request and result.</w:t>
       </w:r>
     </w:p>
-    <w:bookmarkEnd w:id="190"/>
-    <w:bookmarkEnd w:id="191"/>
-    <w:bookmarkStart w:id="192" w:name="the-app-uses-an-unexpected-language"/>
+    <w:bookmarkEnd w:id="196"/>
+    <w:bookmarkEnd w:id="197"/>
+    <w:bookmarkStart w:id="198" w:name="the-app-uses-an-unexpected-language"/>
     <w:p>
       <w:pPr>
         <w:pStyle w:val="Heading2"/>
@@ -14496,7 +15174,7 @@
       <w:r>
         <w:t xml:space="preserve"> </w:t>
       </w:r>
-      <w:hyperlink r:id="rId142">
+      <w:hyperlink r:id="rId148">
         <w:r>
           <w:rPr>
             <w:rStyle w:val="Hyperlink"/>
@@ -14508,8 +15186,8 @@
         <w:t xml:space="preserve">. Choosing Later saves the selection but keeps the current process in its existing language until you quit and reopen DisplayHelp.</w:t>
       </w:r>
     </w:p>
-    <w:bookmarkEnd w:id="192"/>
-    <w:bookmarkEnd w:id="193"/>
+    <w:bookmarkEnd w:id="198"/>
+    <w:bookmarkEnd w:id="199"/>
     <w:sectPr>
       <w:footnotePr>
         <w:numRestart w:val="eachSect"/>
@@ -14974,9 +15652,6 @@
     <w:abstractNumId w:val="991"/>
   </w:num>
   <w:num w:numId="1010">
-    <w:abstractNumId w:val="991"/>
-  </w:num>
-  <w:num w:numId="1011">
     <w:abstractNumId w:val="99411"/>
     <w:lvlOverride w:ilvl="0">
       <w:startOverride w:val="1"/>
@@ -15006,7 +15681,43 @@
       <w:startOverride w:val="1"/>
     </w:lvlOverride>
   </w:num>
+  <w:num w:numId="1011">
+    <w:abstractNumId w:val="991"/>
+  </w:num>
   <w:num w:numId="1012">
+    <w:abstractNumId w:val="991"/>
+  </w:num>
+  <w:num w:numId="1013">
+    <w:abstractNumId w:val="99411"/>
+    <w:lvlOverride w:ilvl="0">
+      <w:startOverride w:val="1"/>
+    </w:lvlOverride>
+    <w:lvlOverride w:ilvl="1">
+      <w:startOverride w:val="1"/>
+    </w:lvlOverride>
+    <w:lvlOverride w:ilvl="2">
+      <w:startOverride w:val="1"/>
+    </w:lvlOverride>
+    <w:lvlOverride w:ilvl="3">
+      <w:startOverride w:val="1"/>
+    </w:lvlOverride>
+    <w:lvlOverride w:ilvl="4">
+      <w:startOverride w:val="1"/>
+    </w:lvlOverride>
+    <w:lvlOverride w:ilvl="5">
+      <w:startOverride w:val="1"/>
+    </w:lvlOverride>
+    <w:lvlOverride w:ilvl="6">
+      <w:startOverride w:val="1"/>
+    </w:lvlOverride>
+    <w:lvlOverride w:ilvl="7">
+      <w:startOverride w:val="1"/>
+    </w:lvlOverride>
+    <w:lvlOverride w:ilvl="8">
+      <w:startOverride w:val="1"/>
+    </w:lvlOverride>
+  </w:num>
+  <w:num w:numId="1014">
     <w:abstractNumId w:val="991"/>
   </w:num>
 </w:numbering>

</xml_diff>